<commit_message>
Roadmap edits: drop standalone JobAdder build, remove sell/commentary lines
JobAdder is now a one-line prerequisite note rather than its own build,
since most items read from our own records anyway. Stripped the editorial
'why this is good' lines (speed to first contact, gets sharper the more we
use it, steady source of new briefs, higher-fee/higher-fill framing) so each
item just describes what it does.

https://claude.ai/code/session_017edYG1kxbp6DYSEMnLxRFa
</commit_message>
<xml_diff>
--- a/VMA_AI.docx
+++ b/VMA_AI.docx
@@ -863,6 +863,20 @@
     <w:p>
       <w:pPr>
         <w:pStyle w:val="Body A"/>
+        <w:shd w:val="clear" w:color="auto" w:fill="fcfdfb"/>
+        <w:spacing w:before="120"/>
+      </w:pPr>
+      <w:r>
+        <w:rPr>
+          <w:rtl w:val="0"/>
+          <w:lang w:val="en-US"/>
+        </w:rPr>
+        <w:t xml:space="preserve">Several of the builds below read from our own records in JobAdder, so they depend on connecting it.</w:t>
+      </w:r>
+    </w:p>
+    <w:p>
+      <w:pPr>
+        <w:pStyle w:val="Body A"/>
         <w:numPr>
           <w:ilvl w:val="0"/>
           <w:numId w:val="4"/>
@@ -882,7 +896,7 @@
           <w:rtl w:val="0"/>
           <w:lang w:val="en-US"/>
         </w:rPr>
-        <w:t xml:space="preserve">The moment a pre-market signal fires, the system names the budget holder and whoever owns the relationship, pulls the people who fit the likely backfill, and drafts both the client approach and the candidate float, ready the same morning, before the role is ever public. Speed to first contact is what wins the brief.</w:t>
+        <w:t xml:space="preserve">The moment a pre-market signal fires, the system names the budget holder and whoever owns the relationship, pulls the people who fit the likely backfill, and drafts both the client approach and the candidate float, ready the same morning, before the role is ever public.</w:t>
       </w:r>
     </w:p>
     <w:p>
@@ -907,7 +921,7 @@
           <w:rtl w:val="0"/>
           <w:lang w:val="en-US"/>
         </w:rPr>
-        <w:t xml:space="preserve">Connect JobAdder. This is the one build that unlocks most of the rest: our own placement, fee and relationship history is data no competitor can copy, and reading it in turns several of the items below from ideas into working features. It is also the lawful, owned alternative to scraping LinkedIn.</w:t>
+        <w:t xml:space="preserve">Match every market signal and live job against our own roster, so each lead shows whether the relationship is already established, who owns it, and which of our people fit the moment a role opens. Lets Pitch Packs and pre-meeting briefs include the real work we have done with that client.</w:t>
       </w:r>
     </w:p>
     <w:p>
@@ -932,7 +946,7 @@
           <w:rtl w:val="0"/>
           <w:lang w:val="en-US"/>
         </w:rPr>
-        <w:t xml:space="preserve">Match every market signal and live job against our own roster, so each lead shows whether the relationship is already established, who owns it, and which of our people fit the moment a role opens. Lets Pitch Packs and pre-meeting briefs cite the real work we have done with that client.</w:t>
+        <w:t xml:space="preserve">Use our placement and fee history to recommend the fee to quote on each brief, flag the clients who habitually negotiate down, and surface the accounts we are under-charging against the market. The same data backs every fee conversation with benchmarks, time to hire and the cost of a bad hire.</w:t>
       </w:r>
     </w:p>
     <w:p>
@@ -957,7 +971,7 @@
           <w:rtl w:val="0"/>
           <w:lang w:val="en-US"/>
         </w:rPr>
-        <w:t xml:space="preserve">Use our placement and fee history to recommend the fee to quote on each brief, flag the clients who habitually negotiate down, and surface the accounts we are under-charging against the market. Every fee conversation is then backed by our own benchmarks, time to hire and the cost of a bad hire.</w:t>
+        <w:t xml:space="preserve">Turn contingent briefs into retained ones by default. The Pitch Pack already does this for a single vacancy on request; firing it automatically the moment a qualifying signal lands applies it to every qualifying brief.</w:t>
       </w:r>
     </w:p>
     <w:p>
@@ -982,7 +996,7 @@
           <w:rtl w:val="0"/>
           <w:lang w:val="en-US"/>
         </w:rPr>
-        <w:t xml:space="preserve">Turn contingent briefs into retained ones by default. The Pitch Pack already does this for a single vacancy on request; firing it automatically the moment a qualifying signal lands makes the higher-fee, higher-fill retained route the standard move rather than the exception.</w:t>
+        <w:t xml:space="preserve">After each placement, map the rest of that client's communications and talent org and surface the adjacent seats worth going after next, so one placement becomes three.</w:t>
       </w:r>
     </w:p>
     <w:p>
@@ -1007,7 +1021,7 @@
           <w:rtl w:val="0"/>
           <w:lang w:val="en-US"/>
         </w:rPr>
-        <w:t xml:space="preserve">After each placement, map the rest of that client's communications and talent org and surface the adjacent seats worth going after next, so one placement becomes three.</w:t>
+        <w:t xml:space="preserve">Quietly keep in touch with everyone we have placed, since they see restructures and new roles first. When one looks ready to move, we can win both the backfill and their next seat.</w:t>
       </w:r>
     </w:p>
     <w:p>
@@ -1032,7 +1046,7 @@
           <w:rtl w:val="0"/>
           <w:lang w:val="en-US"/>
         </w:rPr>
-        <w:t xml:space="preserve">Quietly keep in touch with everyone we have placed, since they see restructures and new roles first. When one looks ready to move, we win both the backfill and their next seat.</w:t>
+        <w:t xml:space="preserve">Rank the dormant database, lapsed clients and candidates we have not spoken to in over a year, by how likely each is to move or brief now, and draft a personalised reactivation message for each, ready to review and send.</w:t>
       </w:r>
     </w:p>
     <w:p>
@@ -1057,7 +1071,7 @@
           <w:rtl w:val="0"/>
           <w:lang w:val="en-US"/>
         </w:rPr>
-        <w:t xml:space="preserve">Rank the dormant database, lapsed clients and candidates we have not spoken to in over a year, by how likely each is to move or brief now, and draft a personalised reactivation message for each, ready for us to review and send.</w:t>
+        <w:t xml:space="preserve">Keep a live watchlist of senior comms people and score the early signs they may move: long tenure, our own notes from past conversations, or a current employer in the middle of a reshuffle. When one comes free, build the list of clients to float them to, weighted to where we already hold a warm relationship or have placed before.</w:t>
       </w:r>
     </w:p>
     <w:p>
@@ -1082,7 +1096,7 @@
           <w:rtl w:val="0"/>
           <w:lang w:val="en-US"/>
         </w:rPr>
-        <w:t xml:space="preserve">Keep a live watchlist of senior comms people and score the early signs they may move: long tenure, our own notes from past conversations, or a current employer in the middle of a reshuffle. When one comes free, build the list of clients to float them to, weighted to where we already hold a warm relationship or have placed before.</w:t>
+        <w:t xml:space="preserve">Flag accounts cooling toward in-house before they go quiet, read from our own data: their brief volume is dropping, or we are losing roles we used to win. The system prompts the intervention while the relationship is still warm.</w:t>
       </w:r>
     </w:p>
     <w:p>
@@ -1107,7 +1121,7 @@
           <w:rtl w:val="0"/>
           <w:lang w:val="en-US"/>
         </w:rPr>
-        <w:t xml:space="preserve">Flag accounts cooling toward in-house before they go quiet, read from our own data: their brief volume is dropping, or we are losing roles we used to win. The system prompts the intervention while the relationship is still warm.</w:t>
+        <w:t xml:space="preserve">Close the loop. Feed every outcome back in, which signals became briefs, which pitches won and at what fee, so the ranking is built from our own results rather than generic rules.</w:t>
       </w:r>
     </w:p>
     <w:p>
@@ -1132,7 +1146,25 @@
           <w:rtl w:val="0"/>
           <w:lang w:val="en-US"/>
         </w:rPr>
-        <w:t xml:space="preserve">Close the loop. Feed every outcome back in, which signals became briefs, which pitches won and at what fee, so the ranking tunes itself on our own results and the tool gets sharper the more we use it.</w:t>
+        <w:t xml:space="preserve">Run the quarterly roundtables off the radar: build the invite list by theme, time it to live signals, and sequence the follow-up.</w:t>
+      </w:r>
+    </w:p>
+    <w:p>
+      <w:pPr>
+        <w:pStyle w:val="Body A"/>
+        <w:shd w:val="clear" w:color="auto" w:fill="fcfdfb"/>
+        <w:spacing w:before="240"/>
+      </w:pPr>
+      <w:r>
+        <w:rPr>
+          <w:b w:val="1"/>
+          <w:bCs w:val="1"/>
+          <w:sz w:val="24"/>
+          <w:szCs w:val="24"/>
+          <w:rtl w:val="0"/>
+          <w:lang w:val="en-US"/>
+        </w:rPr>
+        <w:t xml:space="preserve">Deliberately not building (for now)</w:t>
       </w:r>
     </w:p>
     <w:p>
@@ -1157,25 +1189,7 @@
           <w:rtl w:val="0"/>
           <w:lang w:val="en-US"/>
         </w:rPr>
-        <w:t xml:space="preserve">Run the quarterly roundtables off the radar: build the invite list by theme, time it to live signals, and sequence the follow-up, turning our events into a steady source of new briefs.</w:t>
-      </w:r>
-    </w:p>
-    <w:p>
-      <w:pPr>
-        <w:pStyle w:val="Body A"/>
-        <w:shd w:val="clear" w:color="auto" w:fill="fcfdfb"/>
-        <w:spacing w:before="240"/>
-      </w:pPr>
-      <w:r>
-        <w:rPr>
-          <w:b w:val="1"/>
-          <w:bCs w:val="1"/>
-          <w:sz w:val="24"/>
-          <w:szCs w:val="24"/>
-          <w:rtl w:val="0"/>
-          <w:lang w:val="en-US"/>
-        </w:rPr>
-        <w:t xml:space="preserve">Deliberately not building (for now)</w:t>
+        <w:t xml:space="preserve">A button that sends outreach automatically on your behalf. Drafting it for one-click review is fine; sending it without a human risks our sender reputation, our voice and the data-protection rules.</w:t>
       </w:r>
     </w:p>
     <w:p>
@@ -1200,7 +1214,7 @@
           <w:rtl w:val="0"/>
           <w:lang w:val="en-US"/>
         </w:rPr>
-        <w:t xml:space="preserve">A button that sends outreach on your behalf. Drafting the message for one-click review is useful; firing it automatically risks our sender reputation, our voice and the data rules, for no real time saved.</w:t>
+        <w:t xml:space="preserve">Scraping LinkedIn for profile changes, activity spikes or a client's internal hires. It breaks LinkedIn's terms, which are now actively enforced, and the owned-data versions above cover the same ground.</w:t>
       </w:r>
     </w:p>
     <w:p>
@@ -1225,32 +1239,7 @@
           <w:rtl w:val="0"/>
           <w:lang w:val="en-US"/>
         </w:rPr>
-        <w:t xml:space="preserve">Scraping LinkedIn for profile changes, activity spikes or a client's internal hires. It breaks LinkedIn's terms in an era when that is now being enforced, and the owned-data versions above are both safer and more accurate.</w:t>
-      </w:r>
-    </w:p>
-    <w:p>
-      <w:pPr>
-        <w:pStyle w:val="Body A"/>
-        <w:numPr>
-          <w:ilvl w:val="0"/>
-          <w:numId w:val="4"/>
-        </w:numPr>
-        <w:shd w:val="clear" w:color="auto" w:fill="fcfdfb"/>
-        <w:bidi w:val="0"/>
-        <w:spacing w:before="120"/>
-        <w:ind w:right="0"/>
-        <w:jc w:val="left"/>
-        <w:rPr>
-          <w:rtl w:val="0"/>
-          <w:lang w:val="en-US"/>
-        </w:rPr>
-      </w:pPr>
-      <w:r>
-        <w:rPr>
-          <w:rtl w:val="0"/>
-          <w:lang w:val="en-US"/>
-        </w:rPr>
-        <w:t xml:space="preserve">An on-demand 100 to 150 name longlist. It is a commodity the big sourcing tools already sell, it needs either scraping or costly licensed data, and senior comms searches are won on the curated shortlist, not the long one.</w:t>
+        <w:t xml:space="preserve">An on-demand 100 to 150 name longlist. It is already sold by the big sourcing tools and needs either scraping or paid-for licensed data.</w:t>
       </w:r>
     </w:p>
     <w:sectPr>

</xml_diff>